<commit_message>
test: normalize english checklist fixtures
</commit_message>
<xml_diff>
--- a/tests/fixtures/import/review_checklist_import/english-word.docx
+++ b/tests/fixtures/import/review_checklist_import/english-word.docx
@@ -3,150 +3,420 @@
 <w:document xmlns:wpc="http://schemas.microsoft.com/office/word/2010/wordprocessingCanvas" xmlns:mo="http://schemas.microsoft.com/office/mac/office/2008/main" xmlns:mc="http://schemas.openxmlformats.org/markup-compatibility/2006" xmlns:mv="urn:schemas-microsoft-com:mac:vml" xmlns:o="urn:schemas-microsoft-com:office:office" xmlns:r="http://schemas.openxmlformats.org/officeDocument/2006/relationships" xmlns:m="http://schemas.openxmlformats.org/officeDocument/2006/math" xmlns:v="urn:schemas-microsoft-com:vml" xmlns:wp14="http://schemas.microsoft.com/office/word/2010/wordprocessingDrawing" xmlns:wp="http://schemas.openxmlformats.org/drawingml/2006/wordprocessingDrawing" xmlns:w10="urn:schemas-microsoft-com:office:word" xmlns:w="http://schemas.openxmlformats.org/wordprocessingml/2006/main" xmlns:w14="http://schemas.microsoft.com/office/word/2010/wordml" xmlns:wpg="http://schemas.microsoft.com/office/word/2010/wordprocessingGroup" xmlns:wpi="http://schemas.microsoft.com/office/word/2010/wordprocessingInk" xmlns:wne="http://schemas.microsoft.com/office/word/2006/wordml" xmlns:wps="http://schemas.microsoft.com/office/word/2010/wordprocessingShape" mc:Ignorable="w14 wp14">
   <w:body>
     <w:p>
+      <w:pPr>
+        <w:pStyle w:val="Title"/>
+        <w:jc w:val="center"/>
+      </w:pPr>
       <w:r>
         <w:t>English Review Checklist 20260511</w:t>
       </w:r>
     </w:p>
     <w:p>
+      <w:pPr>
+        <w:jc w:val="center"/>
+      </w:pPr>
       <w:r>
-        <w:t>文档类型：采购合同审查清单</w:t>
+        <w:rPr>
+          <w:i/>
+        </w:rPr>
+        <w:t>Paragraph-based import sample. No tables are used in this Word document.</w:t>
       </w:r>
     </w:p>
     <w:p>
+      <w:pPr>
+        <w:pStyle w:val="Heading1"/>
+      </w:pPr>
       <w:r>
-        <w:t>说明：English content preservation regression sample.</w:t>
+        <w:t>Basic Information</w:t>
       </w:r>
     </w:p>
     <w:p>
+      <w:pPr>
+        <w:spacing w:after="60"/>
+      </w:pPr>
       <w:r>
-        <w:t>一、基础信息</w:t>
+        <w:rPr>
+          <w:b/>
+        </w:rPr>
+        <w:t xml:space="preserve">Checklist name: </w:t>
+      </w:r>
+      <w:r>
+        <w:t>English Word Review Checklist 20260511</w:t>
       </w:r>
     </w:p>
     <w:p>
+      <w:pPr>
+        <w:spacing w:after="60"/>
+      </w:pPr>
       <w:r>
-        <w:t>适用合同类型：Procurement Agreement</w:t>
+        <w:rPr>
+          <w:b/>
+        </w:rPr>
+        <w:t xml:space="preserve">Applicable contract type: </w:t>
+      </w:r>
+      <w:r>
+        <w:t>Procurement Agreement</w:t>
       </w:r>
     </w:p>
     <w:p>
+      <w:pPr>
+        <w:spacing w:after="60"/>
+      </w:pPr>
       <w:r>
-        <w:t>适用场景：English checklist import regression</w:t>
+        <w:rPr>
+          <w:b/>
+        </w:rPr>
+        <w:t xml:space="preserve">Purpose: </w:t>
+      </w:r>
+      <w:r>
+        <w:t>English content preservation regression sample for review checklist import.</w:t>
       </w:r>
     </w:p>
     <w:p>
+      <w:pPr>
+        <w:spacing w:after="60"/>
+      </w:pPr>
       <w:r>
-        <w:t>二、重点审查项</w:t>
+        <w:rPr>
+          <w:b/>
+        </w:rPr>
+        <w:t xml:space="preserve">Scenario: </w:t>
       </w:r>
-    </w:p>
-    <w:tbl>
-      <w:tblPr>
-        <w:tblStyle w:val="TableGrid"/>
-        <w:tblW w:type="auto" w:w="0"/>
-        <w:tblLook w:firstColumn="1" w:firstRow="1" w:lastColumn="0" w:lastRow="0" w:noHBand="0" w:noVBand="1" w:val="04A0"/>
-      </w:tblPr>
-      <w:tblGrid>
-        <w:gridCol w:w="2160"/>
-        <w:gridCol w:w="2160"/>
-        <w:gridCol w:w="2160"/>
-        <w:gridCol w:w="2160"/>
-      </w:tblGrid>
-      <w:tr>
-        <w:tc>
-          <w:tcPr>
-            <w:tcW w:type="dxa" w:w="2160"/>
-          </w:tcPr>
-          <w:p>
-            <w:r>
-              <w:t>审查项</w:t>
-            </w:r>
-          </w:p>
-        </w:tc>
-        <w:tc>
-          <w:tcPr>
-            <w:tcW w:type="dxa" w:w="2160"/>
-          </w:tcPr>
-          <w:p>
-            <w:r>
-              <w:t>审查标准</w:t>
-            </w:r>
-          </w:p>
-        </w:tc>
-        <w:tc>
-          <w:tcPr>
-            <w:tcW w:type="dxa" w:w="2160"/>
-          </w:tcPr>
-          <w:p>
-            <w:r>
-              <w:t>风险等级</w:t>
-            </w:r>
-          </w:p>
-        </w:tc>
-        <w:tc>
-          <w:tcPr>
-            <w:tcW w:type="dxa" w:w="2160"/>
-          </w:tcPr>
-          <w:p>
-            <w:r>
-              <w:t>处理建议</w:t>
-            </w:r>
-          </w:p>
-        </w:tc>
-      </w:tr>
-      <w:tr>
-        <w:tc>
-          <w:tcPr>
-            <w:tcW w:type="dxa" w:w="2160"/>
-          </w:tcPr>
-          <w:p>
-            <w:r>
-              <w:t>Confidentiality Notice Must Remain in English</w:t>
-            </w:r>
-          </w:p>
-        </w:tc>
-        <w:tc>
-          <w:tcPr>
-            <w:tcW w:type="dxa" w:w="2160"/>
-          </w:tcPr>
-          <w:p>
-            <w:r>
-              <w:t>The supplier shall keep all confidential information strictly protected and shall notify the buyer before any disclosure.</w:t>
-            </w:r>
-          </w:p>
-        </w:tc>
-        <w:tc>
-          <w:tcPr>
-            <w:tcW w:type="dxa" w:w="2160"/>
-          </w:tcPr>
-          <w:p>
-            <w:r>
-              <w:t>高</w:t>
-            </w:r>
-          </w:p>
-        </w:tc>
-        <w:tc>
-          <w:tcPr>
-            <w:tcW w:type="dxa" w:w="2160"/>
-          </w:tcPr>
-          <w:p>
-            <w:r>
-              <w:t>Request legal review before approval when the confidentiality clause is missing.</w:t>
-            </w:r>
-          </w:p>
-        </w:tc>
-      </w:tr>
-    </w:tbl>
-    <w:p>
       <w:r>
-        <w:t>三、补充规则</w:t>
+        <w:t>Cross-border procurement and technology service purchases.</w:t>
       </w:r>
     </w:p>
     <w:p>
+      <w:pPr>
+        <w:pStyle w:val="Heading1"/>
+      </w:pPr>
       <w:r>
-        <w:t>1. The checklist language must remain English after import.</w:t>
+        <w:t>Review Rules</w:t>
+      </w:r>
+    </w:p>
+    <w:p>
+      <w:pPr>
+        <w:pStyle w:val="Heading2"/>
+      </w:pPr>
+      <w:r>
+        <w:t>Rule 1 - Confidentiality obligation</w:t>
+      </w:r>
+    </w:p>
+    <w:p>
+      <w:pPr>
+        <w:spacing w:after="60"/>
+      </w:pPr>
+      <w:r>
+        <w:rPr>
+          <w:b/>
+        </w:rPr>
+        <w:t xml:space="preserve">Review item: </w:t>
+      </w:r>
+      <w:r>
+        <w:t>Confidentiality obligation</w:t>
+      </w:r>
+    </w:p>
+    <w:p>
+      <w:pPr>
+        <w:spacing w:after="60"/>
+      </w:pPr>
+      <w:r>
+        <w:rPr>
+          <w:b/>
+        </w:rPr>
+        <w:t xml:space="preserve">Review standard: </w:t>
+      </w:r>
+      <w:r>
+        <w:t>The agreement must include an English confidentiality clause covering confidential information, disclosure restrictions, survival period, and permitted recipients.</w:t>
+      </w:r>
+    </w:p>
+    <w:p>
+      <w:pPr>
+        <w:spacing w:after="60"/>
+      </w:pPr>
+      <w:r>
+        <w:rPr>
+          <w:b/>
+        </w:rPr>
+        <w:t xml:space="preserve">Risk level: </w:t>
+      </w:r>
+      <w:r>
+        <w:t>High</w:t>
+      </w:r>
+    </w:p>
+    <w:p>
+      <w:pPr>
+        <w:spacing w:after="60"/>
+      </w:pPr>
+      <w:r>
+        <w:rPr>
+          <w:b/>
+        </w:rPr>
+        <w:t xml:space="preserve">Action guidance: </w:t>
+      </w:r>
+      <w:r>
+        <w:t>Flag the contract as high risk if confidential information can be disclosed without prior written consent.</w:t>
+      </w:r>
+    </w:p>
+    <w:p>
+      <w:pPr>
+        <w:pStyle w:val="Heading2"/>
+      </w:pPr>
+      <w:r>
+        <w:t>Rule 2 - Payment schedule</w:t>
+      </w:r>
+    </w:p>
+    <w:p>
+      <w:pPr>
+        <w:spacing w:after="60"/>
+      </w:pPr>
+      <w:r>
+        <w:rPr>
+          <w:b/>
+        </w:rPr>
+        <w:t xml:space="preserve">Review item: </w:t>
+      </w:r>
+      <w:r>
+        <w:t>Payment schedule</w:t>
+      </w:r>
+    </w:p>
+    <w:p>
+      <w:pPr>
+        <w:spacing w:after="60"/>
+      </w:pPr>
+      <w:r>
+        <w:rPr>
+          <w:b/>
+        </w:rPr>
+        <w:t xml:space="preserve">Review standard: </w:t>
+      </w:r>
+      <w:r>
+        <w:t>Payment milestones, invoice requirements, tax treatment, currency, and late-payment consequences must be stated in clear English.</w:t>
+      </w:r>
+    </w:p>
+    <w:p>
+      <w:pPr>
+        <w:spacing w:after="60"/>
+      </w:pPr>
+      <w:r>
+        <w:rPr>
+          <w:b/>
+        </w:rPr>
+        <w:t xml:space="preserve">Risk level: </w:t>
+      </w:r>
+      <w:r>
+        <w:t>High</w:t>
+      </w:r>
+    </w:p>
+    <w:p>
+      <w:pPr>
+        <w:spacing w:after="60"/>
+      </w:pPr>
+      <w:r>
+        <w:rPr>
+          <w:b/>
+        </w:rPr>
+        <w:t xml:space="preserve">Action guidance: </w:t>
+      </w:r>
+      <w:r>
+        <w:t>Require finance and legal review when payment timing, amount, or invoice conditions are ambiguous.</w:t>
+      </w:r>
+    </w:p>
+    <w:p>
+      <w:pPr>
+        <w:pStyle w:val="Heading2"/>
+      </w:pPr>
+      <w:r>
+        <w:t>Rule 3 - Delivery and acceptance</w:t>
+      </w:r>
+    </w:p>
+    <w:p>
+      <w:pPr>
+        <w:spacing w:after="60"/>
+      </w:pPr>
+      <w:r>
+        <w:rPr>
+          <w:b/>
+        </w:rPr>
+        <w:t xml:space="preserve">Review item: </w:t>
+      </w:r>
+      <w:r>
+        <w:t>Delivery and acceptance</w:t>
+      </w:r>
+    </w:p>
+    <w:p>
+      <w:pPr>
+        <w:spacing w:after="60"/>
+      </w:pPr>
+      <w:r>
+        <w:rPr>
+          <w:b/>
+        </w:rPr>
+        <w:t xml:space="preserve">Review standard: </w:t>
+      </w:r>
+      <w:r>
+        <w:t>The contract must define delivery date, delivery location, acceptance criteria, inspection period, and rejection procedure.</w:t>
+      </w:r>
+    </w:p>
+    <w:p>
+      <w:pPr>
+        <w:spacing w:after="60"/>
+      </w:pPr>
+      <w:r>
+        <w:rPr>
+          <w:b/>
+        </w:rPr>
+        <w:t xml:space="preserve">Risk level: </w:t>
+      </w:r>
+      <w:r>
+        <w:t>Medium</w:t>
+      </w:r>
+    </w:p>
+    <w:p>
+      <w:pPr>
+        <w:spacing w:after="60"/>
+      </w:pPr>
+      <w:r>
+        <w:rPr>
+          <w:b/>
+        </w:rPr>
+        <w:t xml:space="preserve">Action guidance: </w:t>
+      </w:r>
+      <w:r>
+        <w:t>Ask the business owner to add objective acceptance standards before approval.</w:t>
+      </w:r>
+    </w:p>
+    <w:p>
+      <w:pPr>
+        <w:pStyle w:val="Heading2"/>
+      </w:pPr>
+      <w:r>
+        <w:t>Rule 4 - Intellectual property ownership</w:t>
+      </w:r>
+    </w:p>
+    <w:p>
+      <w:pPr>
+        <w:spacing w:after="60"/>
+      </w:pPr>
+      <w:r>
+        <w:rPr>
+          <w:b/>
+        </w:rPr>
+        <w:t xml:space="preserve">Review item: </w:t>
+      </w:r>
+      <w:r>
+        <w:t>Intellectual property ownership</w:t>
+      </w:r>
+    </w:p>
+    <w:p>
+      <w:pPr>
+        <w:spacing w:after="60"/>
+      </w:pPr>
+      <w:r>
+        <w:rPr>
+          <w:b/>
+        </w:rPr>
+        <w:t xml:space="preserve">Review standard: </w:t>
+      </w:r>
+      <w:r>
+        <w:t>Ownership of deliverables, background technology, license scope, and restrictions on third-party materials must be allocated expressly.</w:t>
+      </w:r>
+    </w:p>
+    <w:p>
+      <w:pPr>
+        <w:spacing w:after="60"/>
+      </w:pPr>
+      <w:r>
+        <w:rPr>
+          <w:b/>
+        </w:rPr>
+        <w:t xml:space="preserve">Risk level: </w:t>
+      </w:r>
+      <w:r>
+        <w:t>High</w:t>
+      </w:r>
+    </w:p>
+    <w:p>
+      <w:pPr>
+        <w:spacing w:after="60"/>
+      </w:pPr>
+      <w:r>
+        <w:rPr>
+          <w:b/>
+        </w:rPr>
+        <w:t xml:space="preserve">Action guidance: </w:t>
+      </w:r>
+      <w:r>
+        <w:t>Escalate to legal if ownership or license rights are missing or inconsistent.</w:t>
+      </w:r>
+    </w:p>
+    <w:p>
+      <w:pPr>
+        <w:pStyle w:val="Heading2"/>
+      </w:pPr>
+      <w:r>
+        <w:t>Rule 5 - Termination and liability</w:t>
+      </w:r>
+    </w:p>
+    <w:p>
+      <w:pPr>
+        <w:spacing w:after="60"/>
+      </w:pPr>
+      <w:r>
+        <w:rPr>
+          <w:b/>
+        </w:rPr>
+        <w:t xml:space="preserve">Review item: </w:t>
+      </w:r>
+      <w:r>
+        <w:t>Termination and liability</w:t>
+      </w:r>
+    </w:p>
+    <w:p>
+      <w:pPr>
+        <w:spacing w:after="60"/>
+      </w:pPr>
+      <w:r>
+        <w:rPr>
+          <w:b/>
+        </w:rPr>
+        <w:t xml:space="preserve">Review standard: </w:t>
+      </w:r>
+      <w:r>
+        <w:t>Termination triggers, notice period, cure period, liability cap, excluded damages, and survival obligations must be complete.</w:t>
+      </w:r>
+    </w:p>
+    <w:p>
+      <w:pPr>
+        <w:spacing w:after="60"/>
+      </w:pPr>
+      <w:r>
+        <w:rPr>
+          <w:b/>
+        </w:rPr>
+        <w:t xml:space="preserve">Risk level: </w:t>
+      </w:r>
+      <w:r>
+        <w:t>Medium</w:t>
+      </w:r>
+    </w:p>
+    <w:p>
+      <w:pPr>
+        <w:spacing w:after="60"/>
+      </w:pPr>
+      <w:r>
+        <w:rPr>
+          <w:b/>
+        </w:rPr>
+        <w:t xml:space="preserve">Action guidance: </w:t>
+      </w:r>
+      <w:r>
+        <w:t>Request revisions when termination rights or liability boundaries are one-sided or undefined.</w:t>
       </w:r>
     </w:p>
     <w:sectPr>
       <w:pgSz w:w="12240" w:h="15840"/>
-      <w:pgMar w:top="1440" w:right="1800" w:bottom="1440" w:left="1800" w:header="720" w:footer="720" w:gutter="0"/>
+      <w:pgMar w:top="1080" w:right="1080" w:bottom="1080" w:left="1080" w:header="720" w:footer="720" w:gutter="0"/>
       <w:cols w:space="720"/>
       <w:docGrid w:linePitch="360"/>
     </w:sectPr>
@@ -517,6 +787,10 @@
     <w:name w:val="Normal"/>
     <w:qFormat/>
     <w:rsid w:val="00FC693F"/>
+    <w:rPr>
+      <w:rFonts w:ascii="Arial" w:hAnsi="Arial"/>
+      <w:sz w:val="21"/>
+    </w:rPr>
   </w:style>
   <w:style w:type="paragraph" w:styleId="Header">
     <w:name w:val="header"/>
@@ -577,11 +851,11 @@
       <w:outlineLvl w:val="0"/>
     </w:pPr>
     <w:rPr>
-      <w:rFonts w:asciiTheme="majorHAnsi" w:eastAsiaTheme="majorEastAsia" w:hAnsiTheme="majorHAnsi" w:cstheme="majorBidi"/>
+      <w:rFonts w:asciiTheme="majorHAnsi" w:eastAsiaTheme="majorEastAsia" w:hAnsiTheme="majorHAnsi" w:cstheme="majorBidi" w:ascii="Arial" w:hAnsi="Arial"/>
       <w:b/>
       <w:bCs/>
       <w:color w:val="365F91" w:themeColor="accent1" w:themeShade="BF"/>
-      <w:sz w:val="28"/>
+      <w:sz w:val="26"/>
       <w:szCs w:val="28"/>
     </w:rPr>
   </w:style>
@@ -601,11 +875,11 @@
       <w:outlineLvl w:val="1"/>
     </w:pPr>
     <w:rPr>
-      <w:rFonts w:asciiTheme="majorHAnsi" w:eastAsiaTheme="majorEastAsia" w:hAnsiTheme="majorHAnsi" w:cstheme="majorBidi"/>
+      <w:rFonts w:asciiTheme="majorHAnsi" w:eastAsiaTheme="majorEastAsia" w:hAnsiTheme="majorHAnsi" w:cstheme="majorBidi" w:ascii="Arial" w:hAnsi="Arial"/>
       <w:b/>
       <w:bCs/>
       <w:color w:val="4F81BD" w:themeColor="accent1"/>
-      <w:sz w:val="26"/>
+      <w:sz w:val="23"/>
       <w:szCs w:val="26"/>
     </w:rPr>
   </w:style>
@@ -866,11 +1140,12 @@
       <w:contextualSpacing/>
     </w:pPr>
     <w:rPr>
-      <w:rFonts w:asciiTheme="majorHAnsi" w:eastAsiaTheme="majorEastAsia" w:hAnsiTheme="majorHAnsi" w:cstheme="majorBidi"/>
+      <w:rFonts w:asciiTheme="majorHAnsi" w:eastAsiaTheme="majorEastAsia" w:hAnsiTheme="majorHAnsi" w:cstheme="majorBidi" w:ascii="Arial" w:hAnsi="Arial"/>
+      <w:b/>
       <w:color w:val="17365D" w:themeColor="text2" w:themeShade="BF"/>
       <w:spacing w:val="5"/>
       <w:kern w:val="28"/>
-      <w:sz w:val="52"/>
+      <w:sz w:val="36"/>
       <w:szCs w:val="52"/>
     </w:rPr>
   </w:style>

</xml_diff>